<commit_message>
feat: can be prescribed 3 drugs in one prescription
</commit_message>
<xml_diff>
--- a/templates/prescription_107-1u_template.docx
+++ b/templates/prescription_107-1u_template.docx
@@ -711,7 +711,6 @@
                 <w:lang w:val="en-US"/>
               </w:rPr>
             </w:pPr>
-            <w:proofErr w:type="gramStart"/>
             <w:r>
               <w:rPr>
                 <w:b/>
@@ -720,18 +719,7 @@
                 <w:szCs w:val="24"/>
                 <w:lang w:val="en-US"/>
               </w:rPr>
-              <w:t>{{ d</w:t>
-            </w:r>
-            <w:proofErr w:type="gramEnd"/>
-            <w:r>
-              <w:rPr>
-                <w:b/>
-                <w:bCs/>
-                <w:sz w:val="24"/>
-                <w:szCs w:val="24"/>
-                <w:lang w:val="en-US"/>
-              </w:rPr>
-              <w:t xml:space="preserve"> }}</w:t>
+              <w:t>{{ d }}</w:t>
             </w:r>
           </w:p>
         </w:tc>
@@ -775,7 +763,6 @@
                 <w:lang w:val="en-US"/>
               </w:rPr>
             </w:pPr>
-            <w:proofErr w:type="gramStart"/>
             <w:r>
               <w:rPr>
                 <w:b/>
@@ -784,18 +771,7 @@
                 <w:szCs w:val="24"/>
                 <w:lang w:val="en-US"/>
               </w:rPr>
-              <w:t>{{ m</w:t>
-            </w:r>
-            <w:proofErr w:type="gramEnd"/>
-            <w:r>
-              <w:rPr>
-                <w:b/>
-                <w:bCs/>
-                <w:sz w:val="24"/>
-                <w:szCs w:val="24"/>
-                <w:lang w:val="en-US"/>
-              </w:rPr>
-              <w:t xml:space="preserve"> }}</w:t>
+              <w:t>{{ m }}</w:t>
             </w:r>
           </w:p>
         </w:tc>
@@ -839,7 +815,6 @@
                 <w:lang w:val="en-US"/>
               </w:rPr>
             </w:pPr>
-            <w:proofErr w:type="gramStart"/>
             <w:r>
               <w:rPr>
                 <w:b/>
@@ -848,18 +823,7 @@
                 <w:szCs w:val="24"/>
                 <w:lang w:val="en-US"/>
               </w:rPr>
-              <w:t>{{ y</w:t>
-            </w:r>
-            <w:proofErr w:type="gramEnd"/>
-            <w:r>
-              <w:rPr>
-                <w:b/>
-                <w:bCs/>
-                <w:sz w:val="24"/>
-                <w:szCs w:val="24"/>
-                <w:lang w:val="en-US"/>
-              </w:rPr>
-              <w:t xml:space="preserve"> }}</w:t>
+              <w:t>{{ y }}</w:t>
             </w:r>
           </w:p>
         </w:tc>
@@ -916,13 +880,6 @@
           <w:szCs w:val="22"/>
         </w:rPr>
         <w:br/>
-      </w:r>
-      <w:proofErr w:type="gramStart"/>
-      <w:r>
-        <w:rPr>
-          <w:sz w:val="22"/>
-          <w:szCs w:val="22"/>
-        </w:rPr>
         <w:t xml:space="preserve">пациента  </w:t>
       </w:r>
       <w:r>
@@ -944,7 +901,6 @@
         </w:rPr>
         <w:t>patient</w:t>
       </w:r>
-      <w:proofErr w:type="gramEnd"/>
       <w:r>
         <w:rPr>
           <w:b/>
@@ -954,8 +910,6 @@
         </w:rPr>
         <w:t>_</w:t>
       </w:r>
-      <w:proofErr w:type="spellStart"/>
-      <w:proofErr w:type="gramStart"/>
       <w:r>
         <w:rPr>
           <w:b/>
@@ -966,7 +920,6 @@
         </w:rPr>
         <w:t>fio</w:t>
       </w:r>
-      <w:proofErr w:type="spellEnd"/>
       <w:r>
         <w:rPr>
           <w:b/>
@@ -974,17 +927,7 @@
           <w:sz w:val="22"/>
           <w:szCs w:val="22"/>
         </w:rPr>
-        <w:t xml:space="preserve"> }</w:t>
-      </w:r>
-      <w:proofErr w:type="gramEnd"/>
-      <w:r>
-        <w:rPr>
-          <w:b/>
-          <w:bCs/>
-          <w:sz w:val="22"/>
-          <w:szCs w:val="22"/>
-        </w:rPr>
-        <w:t>}</w:t>
+        <w:t xml:space="preserve"> }}</w:t>
       </w:r>
     </w:p>
     <w:p>
@@ -1012,15 +955,7 @@
           <w:sz w:val="22"/>
           <w:szCs w:val="22"/>
         </w:rPr>
-        <w:t xml:space="preserve">Дата </w:t>
-      </w:r>
-      <w:proofErr w:type="gramStart"/>
-      <w:r>
-        <w:rPr>
-          <w:sz w:val="22"/>
-          <w:szCs w:val="22"/>
-        </w:rPr>
-        <w:t xml:space="preserve">рождения  </w:t>
+        <w:t xml:space="preserve">Дата рождения  </w:t>
       </w:r>
       <w:r>
         <w:rPr>
@@ -1041,7 +976,6 @@
         </w:rPr>
         <w:t>patient</w:t>
       </w:r>
-      <w:proofErr w:type="gramEnd"/>
       <w:r>
         <w:rPr>
           <w:b/>
@@ -1051,7 +985,6 @@
         </w:rPr>
         <w:t>_</w:t>
       </w:r>
-      <w:proofErr w:type="gramStart"/>
       <w:r>
         <w:rPr>
           <w:b/>
@@ -1069,17 +1002,7 @@
           <w:sz w:val="22"/>
           <w:szCs w:val="22"/>
         </w:rPr>
-        <w:t xml:space="preserve"> }</w:t>
-      </w:r>
-      <w:proofErr w:type="gramEnd"/>
-      <w:r>
-        <w:rPr>
-          <w:b/>
-          <w:bCs/>
-          <w:sz w:val="22"/>
-          <w:szCs w:val="22"/>
-        </w:rPr>
-        <w:t>}</w:t>
+        <w:t xml:space="preserve"> }}</w:t>
       </w:r>
     </w:p>
     <w:p>
@@ -1115,15 +1038,7 @@
           <w:szCs w:val="22"/>
         </w:rPr>
         <w:br/>
-        <w:t xml:space="preserve">лечащего врача (фельдшера, </w:t>
-      </w:r>
-      <w:proofErr w:type="gramStart"/>
-      <w:r>
-        <w:rPr>
-          <w:sz w:val="22"/>
-          <w:szCs w:val="22"/>
-        </w:rPr>
-        <w:t xml:space="preserve">акушерки)  </w:t>
+        <w:t xml:space="preserve">лечащего врача (фельдшера, акушерки)  </w:t>
       </w:r>
       <w:r>
         <w:rPr>
@@ -1144,7 +1059,6 @@
         </w:rPr>
         <w:t>doctor</w:t>
       </w:r>
-      <w:proofErr w:type="gramEnd"/>
       <w:r>
         <w:rPr>
           <w:b/>
@@ -1154,8 +1068,6 @@
         </w:rPr>
         <w:t>_</w:t>
       </w:r>
-      <w:proofErr w:type="spellStart"/>
-      <w:proofErr w:type="gramStart"/>
       <w:r>
         <w:rPr>
           <w:b/>
@@ -1166,7 +1078,6 @@
         </w:rPr>
         <w:t>fio</w:t>
       </w:r>
-      <w:proofErr w:type="spellEnd"/>
       <w:r>
         <w:rPr>
           <w:b/>
@@ -1174,17 +1085,7 @@
           <w:sz w:val="22"/>
           <w:szCs w:val="22"/>
         </w:rPr>
-        <w:t xml:space="preserve"> }</w:t>
-      </w:r>
-      <w:proofErr w:type="gramEnd"/>
-      <w:r>
-        <w:rPr>
-          <w:b/>
-          <w:bCs/>
-          <w:sz w:val="22"/>
-          <w:szCs w:val="22"/>
-        </w:rPr>
-        <w:t>}</w:t>
+        <w:t xml:space="preserve"> }}</w:t>
       </w:r>
     </w:p>
     <w:p>
@@ -1311,7 +1212,6 @@
                 <w:lang w:val="en-US"/>
               </w:rPr>
             </w:pPr>
-            <w:proofErr w:type="gramStart"/>
             <w:r>
               <w:rPr>
                 <w:b/>
@@ -1320,18 +1220,7 @@
                 <w:szCs w:val="22"/>
                 <w:lang w:val="en-US"/>
               </w:rPr>
-              <w:t>{{ drug</w:t>
-            </w:r>
-            <w:proofErr w:type="gramEnd"/>
-            <w:r>
-              <w:rPr>
-                <w:b/>
-                <w:bCs/>
-                <w:sz w:val="22"/>
-                <w:szCs w:val="22"/>
-                <w:lang w:val="en-US"/>
-              </w:rPr>
-              <w:t>_1_form_name_dosage }}</w:t>
+              <w:t>{{ drug_1_form_name_dosage }}</w:t>
             </w:r>
           </w:p>
         </w:tc>
@@ -1356,7 +1245,6 @@
                 <w:lang w:val="en-US"/>
               </w:rPr>
             </w:pPr>
-            <w:proofErr w:type="gramStart"/>
             <w:r>
               <w:rPr>
                 <w:b/>
@@ -1365,18 +1253,7 @@
                 <w:szCs w:val="22"/>
                 <w:lang w:val="en-US"/>
               </w:rPr>
-              <w:t>{{ drug</w:t>
-            </w:r>
-            <w:proofErr w:type="gramEnd"/>
-            <w:r>
-              <w:rPr>
-                <w:b/>
-                <w:bCs/>
-                <w:sz w:val="22"/>
-                <w:szCs w:val="22"/>
-                <w:lang w:val="en-US"/>
-              </w:rPr>
-              <w:t>_1_signa }}</w:t>
+              <w:t>{{ drug_1_signa }}</w:t>
             </w:r>
           </w:p>
         </w:tc>
@@ -1511,6 +1388,35 @@
                 <w:szCs w:val="22"/>
               </w:rPr>
             </w:pPr>
+            <w:r>
+              <w:rPr>
+                <w:b/>
+                <w:bCs/>
+                <w:sz w:val="22"/>
+                <w:szCs w:val="22"/>
+                <w:lang w:val="en-US"/>
+              </w:rPr>
+              <w:t>{{ drug_</w:t>
+            </w:r>
+            <w:r>
+              <w:rPr>
+                <w:b/>
+                <w:bCs/>
+                <w:sz w:val="22"/>
+                <w:szCs w:val="22"/>
+              </w:rPr>
+              <w:t>2</w:t>
+            </w:r>
+            <w:r>
+              <w:rPr>
+                <w:b/>
+                <w:bCs/>
+                <w:sz w:val="22"/>
+                <w:szCs w:val="22"/>
+                <w:lang w:val="en-US"/>
+              </w:rPr>
+              <w:t>_form_name_dosage }}</w:t>
+            </w:r>
           </w:p>
         </w:tc>
       </w:tr>
@@ -1531,6 +1437,35 @@
                 <w:szCs w:val="22"/>
               </w:rPr>
             </w:pPr>
+            <w:r>
+              <w:rPr>
+                <w:b/>
+                <w:bCs/>
+                <w:sz w:val="22"/>
+                <w:szCs w:val="22"/>
+                <w:lang w:val="en-US"/>
+              </w:rPr>
+              <w:t>{{ drug_</w:t>
+            </w:r>
+            <w:r>
+              <w:rPr>
+                <w:b/>
+                <w:bCs/>
+                <w:sz w:val="22"/>
+                <w:szCs w:val="22"/>
+              </w:rPr>
+              <w:t>2</w:t>
+            </w:r>
+            <w:r>
+              <w:rPr>
+                <w:b/>
+                <w:bCs/>
+                <w:sz w:val="22"/>
+                <w:szCs w:val="22"/>
+                <w:lang w:val="en-US"/>
+              </w:rPr>
+              <w:t>_signa }}</w:t>
+            </w:r>
           </w:p>
         </w:tc>
       </w:tr>
@@ -1664,6 +1599,35 @@
                 <w:szCs w:val="22"/>
               </w:rPr>
             </w:pPr>
+            <w:r>
+              <w:rPr>
+                <w:b/>
+                <w:bCs/>
+                <w:sz w:val="22"/>
+                <w:szCs w:val="22"/>
+                <w:lang w:val="en-US"/>
+              </w:rPr>
+              <w:t>{{ drug_</w:t>
+            </w:r>
+            <w:r>
+              <w:rPr>
+                <w:b/>
+                <w:bCs/>
+                <w:sz w:val="22"/>
+                <w:szCs w:val="22"/>
+              </w:rPr>
+              <w:t>3</w:t>
+            </w:r>
+            <w:r>
+              <w:rPr>
+                <w:b/>
+                <w:bCs/>
+                <w:sz w:val="22"/>
+                <w:szCs w:val="22"/>
+                <w:lang w:val="en-US"/>
+              </w:rPr>
+              <w:t>_form_name_dosage }}</w:t>
+            </w:r>
           </w:p>
         </w:tc>
       </w:tr>
@@ -1684,6 +1648,35 @@
                 <w:szCs w:val="22"/>
               </w:rPr>
             </w:pPr>
+            <w:r>
+              <w:rPr>
+                <w:b/>
+                <w:bCs/>
+                <w:sz w:val="22"/>
+                <w:szCs w:val="22"/>
+                <w:lang w:val="en-US"/>
+              </w:rPr>
+              <w:t>{{ drug_</w:t>
+            </w:r>
+            <w:r>
+              <w:rPr>
+                <w:b/>
+                <w:bCs/>
+                <w:sz w:val="22"/>
+                <w:szCs w:val="22"/>
+              </w:rPr>
+              <w:t>3</w:t>
+            </w:r>
+            <w:r>
+              <w:rPr>
+                <w:b/>
+                <w:bCs/>
+                <w:sz w:val="22"/>
+                <w:szCs w:val="22"/>
+                <w:lang w:val="en-US"/>
+              </w:rPr>
+              <w:t>_signa }}</w:t>
+            </w:r>
           </w:p>
         </w:tc>
       </w:tr>

</xml_diff>